<commit_message>
docs(informe): caso ensayado 1C 2026, análisis y conclusiones
- §3.10 "Caso ensayado: primer cuatrimestre de 2026": el plan y la
  configuración del asignador, cuarto año de Industrial y tercer año de
  Electrónica (traslado martes y jueves), métricas y ocupación por sede,
  y el mismo caso con otros parámetros (sin castigo de subocupación se
  pierde un 30 % de la capacidad libre en la franja más ocupada; sin
  tolerancia de sobreocupación, un 22 % menos de alumnos sin lugar).
- §3.11 completa (desempeño, comparación con el proceso actual,
  limitaciones, objetivos del anteproyecto) y síntesis inicial con sus
  conclusiones.
- Conclusiones: §4.1, §4.5 (configuración recomendada) y §4.6; se
  conserva el texto de §4.2 a §4.4 y se cita ISO 9001 [12].
- Anexo D: cronogramas exportados desde la herramienta.
- Figuras con datos (scripts/figuras_informe.py) y scripts de los
  escenarios (scripts/caso_ensayado/).
- Celdas de tabla alineadas a la izquierda (estilo "Celda").
</commit_message>
<xml_diff>
--- a/scripts/informe_referencia.docx
+++ b/scripts/informe_referencia.docx
@@ -1161,6 +1161,18 @@
     <w:rPr>
       <w:rFonts w:ascii="Arial" w:hAnsi="Arial" w:cs="Arial" w:eastAsia="Arial"/>
       <w:sz w:val="20"/>
+    </w:rPr>
+  </w:style>
+  <w:style w:type="paragraph" w:customStyle="1" w:styleId="Celda">
+    <w:name w:val="Celda"/>
+    <w:basedOn w:val="Normal"/>
+    <w:pPr>
+      <w:spacing w:before="20" w:after="20"/>
+      <w:jc w:val="left"/>
+    </w:pPr>
+    <w:rPr>
+      <w:rFonts w:ascii="Arial" w:hAnsi="Arial" w:cs="Arial" w:eastAsia="Arial"/>
+      <w:sz w:val="18"/>
     </w:rPr>
   </w:style>
   <w:style w:type="paragraph" w:customStyle="1" w:styleId="Notadefigura">

</xml_diff>